<commit_message>
docs: update reflection docx and pdf removing header, footer and stats banner
</commit_message>
<xml_diff>
--- a/docs/reflection.docx
+++ b/docs/reflection.docx
@@ -88,18 +88,6 @@
           <w:sz w:val="22"/>
         </w:rPr>
         <w:t>In future agentic projects, I would establish design layout tokens and reusable UI card primitives during initial setup rather than refining them after backend feature implementation. Furthermore, I would embed automated headless browser visual regression checks directly into subagent milestone gates from day one, catching UX and spacing gaps before proceeding to release verification.</w:t>
-      </w:r>
-    </w:p>
-    <w:p/>
-    <w:p>
-      <w:r>
-        <w:rPr>
-          <w:rFonts w:ascii="Calibri" w:hAnsi="Calibri"/>
-          <w:i/>
-          <w:color w:val="787878"/>
-          <w:sz w:val="19"/>
-        </w:rPr>
-        <w:t>Word Count: 248 words | Verified with 159 Automated Pest Tests &amp; Chrome DevTools MCP</w:t>
       </w:r>
     </w:p>
     <w:sectPr>

</xml_diff>

<commit_message>
docs: add walkthrough videos, submission deliverables index, and update reflection docs
</commit_message>
<xml_diff>
--- a/docs/reflection.docx
+++ b/docs/reflection.docx
@@ -10,8 +10,8 @@
         <w:rPr>
           <w:rFonts w:ascii="Calibri" w:hAnsi="Calibri"/>
           <w:b/>
-          <w:color w:val="107850"/>
-          <w:sz w:val="40"/>
+          <w:color w:val="047857"/>
+          <w:sz w:val="36"/>
         </w:rPr>
         <w:t>Project Reflection: Testimonial Collection SaaS</w:t>
       </w:r>
@@ -21,8 +21,8 @@
         <w:rPr>
           <w:rFonts w:ascii="Calibri" w:hAnsi="Calibri"/>
           <w:i/>
-          <w:color w:val="646464"/>
-          <w:sz w:val="21"/>
+          <w:color w:val="64748B"/>
+          <w:sz w:val="20"/>
         </w:rPr>
         <w:t>Course Assignment Submission | Module 13: Agentic Engineering Workflow</w:t>
         <w:br/>
@@ -35,8 +35,8 @@
         <w:rPr>
           <w:rFonts w:ascii="Calibri" w:hAnsi="Calibri"/>
           <w:b/>
-          <w:color w:val="1E293B"/>
-          <w:sz w:val="26"/>
+          <w:color w:val="0F172A"/>
+          <w:sz w:val="24"/>
         </w:rPr>
         <w:t>1. What worked well with Claude Code &amp; the Agentic Workflow?</w:t>
       </w:r>
@@ -45,7 +45,7 @@
       <w:r>
         <w:rPr>
           <w:rFonts w:ascii="Calibri" w:hAnsi="Calibri"/>
-          <w:sz w:val="22"/>
+          <w:sz w:val="21"/>
         </w:rPr>
         <w:t>Applying the agentic pair-programming workflow with structured context files (CLAUDE.md, CONTEXT.md) provided exceptional development velocity and architectural consistency. Explicit boundaries prevented scope creep and kept business logic strictly on the server. The plan → implement → verify rhythm worked seamlessly: the agent generated database migrations, Cashier Stripe billing, and Inertia React 19 interfaces while adhering strictly to tenant isolation policies. Integrating Model Context Protocol (MCP) tooling—specifically Chrome DevTools MCP for live DOM and viewport screenshot audits—proved game-changing for validating responsive layouts and celebratory micro-interactions without guesswork.</w:t>
       </w:r>
@@ -55,8 +55,8 @@
         <w:rPr>
           <w:rFonts w:ascii="Calibri" w:hAnsi="Calibri"/>
           <w:b/>
-          <w:color w:val="1E293B"/>
-          <w:sz w:val="26"/>
+          <w:color w:val="0F172A"/>
+          <w:sz w:val="24"/>
         </w:rPr>
         <w:t>2. Where did it go wrong, and how was it fixed?</w:t>
       </w:r>
@@ -65,7 +65,7 @@
       <w:r>
         <w:rPr>
           <w:rFonts w:ascii="Calibri" w:hAnsi="Calibri"/>
-          <w:sz w:val="22"/>
+          <w:sz w:val="21"/>
         </w:rPr>
         <w:t>The primary challenge arose during profile photo uploads and settings view refinement. Initially, settings pages suffered from cavernous empty space on wide viewports, and standard PATCH HTTP requests struggled with PHP multipart form parsing boundaries. We diagnosed and resolved this by restructuring the settings layout into a balanced max-w-5xl container using modular card components, configuring dual HTTP method routing (Route::match(['patch', 'post'])), and implementing automated Pest feature tests to guarantee atomic disk storage cleanup whenever avatars were replaced or deleted.</w:t>
       </w:r>
@@ -75,8 +75,8 @@
         <w:rPr>
           <w:rFonts w:ascii="Calibri" w:hAnsi="Calibri"/>
           <w:b/>
-          <w:color w:val="1E293B"/>
-          <w:sz w:val="26"/>
+          <w:color w:val="0F172A"/>
+          <w:sz w:val="24"/>
         </w:rPr>
         <w:t>3. What would I plan differently next time?</w:t>
       </w:r>
@@ -85,14 +85,415 @@
       <w:r>
         <w:rPr>
           <w:rFonts w:ascii="Calibri" w:hAnsi="Calibri"/>
-          <w:sz w:val="22"/>
+          <w:sz w:val="21"/>
         </w:rPr>
         <w:t>In future agentic projects, I would establish design layout tokens and reusable UI card primitives during initial setup rather than refining them after backend feature implementation. Furthermore, I would embed automated headless browser visual regression checks directly into subagent milestone gates from day one, catching UX and spacing gaps before proceeding to release verification.</w:t>
       </w:r>
     </w:p>
+    <w:p/>
+    <w:p>
+      <w:r>
+        <w:rPr>
+          <w:rFonts w:ascii="Calibri" w:hAnsi="Calibri"/>
+          <w:b/>
+          <w:color w:val="047857"/>
+          <w:sz w:val="24"/>
+        </w:rPr>
+        <w:t>Submission Deliverables &amp; Repository Verification Index</w:t>
+      </w:r>
+    </w:p>
+    <w:tbl>
+      <w:tblPr>
+        <w:tblW w:type="auto" w:w="0"/>
+        <w:jc w:val="center"/>
+        <w:tblLayout w:type="fixed"/>
+        <w:tblLook w:firstColumn="1" w:firstRow="1" w:lastColumn="0" w:lastRow="0" w:noHBand="0" w:noVBand="1" w:val="04A0"/>
+      </w:tblPr>
+      <w:tblGrid>
+        <w:gridCol w:w="4968"/>
+        <w:gridCol w:w="4968"/>
+      </w:tblGrid>
+      <w:tr>
+        <w:tc>
+          <w:tcPr>
+            <w:tcW w:type="dxa" w:w="3312"/>
+            <w:shd w:fill="047857"/>
+            <w:tcMar>
+              <w:top w:w="120" w:type="dxa"/>
+              <w:bottom w:w="120" w:type="dxa"/>
+              <w:left w:w="140" w:type="dxa"/>
+              <w:right w:w="140" w:type="dxa"/>
+            </w:tcMar>
+          </w:tcPr>
+          <w:p>
+            <w:r>
+              <w:rPr>
+                <w:rFonts w:ascii="Calibri" w:hAnsi="Calibri"/>
+                <w:b/>
+                <w:color w:val="FFFFFF"/>
+                <w:sz w:val="19"/>
+              </w:rPr>
+              <w:t>Submission Requirement</w:t>
+            </w:r>
+          </w:p>
+        </w:tc>
+        <w:tc>
+          <w:tcPr>
+            <w:tcW w:type="dxa" w:w="6480"/>
+            <w:shd w:fill="047857"/>
+            <w:tcMar>
+              <w:top w:w="120" w:type="dxa"/>
+              <w:bottom w:w="120" w:type="dxa"/>
+              <w:left w:w="140" w:type="dxa"/>
+              <w:right w:w="140" w:type="dxa"/>
+            </w:tcMar>
+          </w:tcPr>
+          <w:p>
+            <w:r>
+              <w:rPr>
+                <w:rFonts w:ascii="Calibri" w:hAnsi="Calibri"/>
+                <w:b/>
+                <w:color w:val="FFFFFF"/>
+                <w:sz w:val="19"/>
+              </w:rPr>
+              <w:t>Repository Location &amp; Details</w:t>
+            </w:r>
+          </w:p>
+        </w:tc>
+      </w:tr>
+      <w:tr>
+        <w:tc>
+          <w:tcPr>
+            <w:tcW w:type="dxa" w:w="3312"/>
+            <w:shd w:fill="F8FAFC"/>
+            <w:tcMar>
+              <w:top w:w="90" w:type="dxa"/>
+              <w:bottom w:w="90" w:type="dxa"/>
+              <w:left w:w="140" w:type="dxa"/>
+              <w:right w:w="140" w:type="dxa"/>
+            </w:tcMar>
+          </w:tcPr>
+          <w:p>
+            <w:r>
+              <w:rPr>
+                <w:rFonts w:ascii="Calibri" w:hAnsi="Calibri"/>
+                <w:b/>
+                <w:color w:val="0F172A"/>
+                <w:sz w:val="18"/>
+              </w:rPr>
+              <w:t>GitHub Repository Link</w:t>
+            </w:r>
+          </w:p>
+        </w:tc>
+        <w:tc>
+          <w:tcPr>
+            <w:tcW w:type="dxa" w:w="6480"/>
+            <w:shd w:fill="F8FAFC"/>
+            <w:tcMar>
+              <w:top w:w="90" w:type="dxa"/>
+              <w:bottom w:w="90" w:type="dxa"/>
+              <w:left w:w="140" w:type="dxa"/>
+              <w:right w:w="140" w:type="dxa"/>
+            </w:tcMar>
+          </w:tcPr>
+          <w:p>
+            <w:r>
+              <w:rPr>
+                <w:rFonts w:ascii="Calibri" w:hAnsi="Calibri"/>
+                <w:color w:val="334155"/>
+                <w:sz w:val="18"/>
+              </w:rPr>
+              <w:t>https://github.com/Enjamam/Testimonials (Public repository)</w:t>
+            </w:r>
+          </w:p>
+        </w:tc>
+      </w:tr>
+      <w:tr>
+        <w:tc>
+          <w:tcPr>
+            <w:tcW w:type="dxa" w:w="3312"/>
+            <w:shd w:fill="FFFFFF"/>
+            <w:tcMar>
+              <w:top w:w="90" w:type="dxa"/>
+              <w:bottom w:w="90" w:type="dxa"/>
+              <w:left w:w="140" w:type="dxa"/>
+              <w:right w:w="140" w:type="dxa"/>
+            </w:tcMar>
+          </w:tcPr>
+          <w:p>
+            <w:r>
+              <w:rPr>
+                <w:rFonts w:ascii="Calibri" w:hAnsi="Calibri"/>
+                <w:b/>
+                <w:color w:val="0F172A"/>
+                <w:sz w:val="18"/>
+              </w:rPr>
+              <w:t>How to Run the Project</w:t>
+            </w:r>
+          </w:p>
+        </w:tc>
+        <w:tc>
+          <w:tcPr>
+            <w:tcW w:type="dxa" w:w="6480"/>
+            <w:shd w:fill="FFFFFF"/>
+            <w:tcMar>
+              <w:top w:w="90" w:type="dxa"/>
+              <w:bottom w:w="90" w:type="dxa"/>
+              <w:left w:w="140" w:type="dxa"/>
+              <w:right w:w="140" w:type="dxa"/>
+            </w:tcMar>
+          </w:tcPr>
+          <w:p>
+            <w:r>
+              <w:rPr>
+                <w:rFonts w:ascii="Calibri" w:hAnsi="Calibri"/>
+                <w:color w:val="334155"/>
+                <w:sz w:val="18"/>
+              </w:rPr>
+              <w:t>Documented in README.md (Prerequisites, migrations, db:seed, composer run dev)</w:t>
+            </w:r>
+          </w:p>
+        </w:tc>
+      </w:tr>
+      <w:tr>
+        <w:tc>
+          <w:tcPr>
+            <w:tcW w:type="dxa" w:w="3312"/>
+            <w:shd w:fill="F8FAFC"/>
+            <w:tcMar>
+              <w:top w:w="90" w:type="dxa"/>
+              <w:bottom w:w="90" w:type="dxa"/>
+              <w:left w:w="140" w:type="dxa"/>
+              <w:right w:w="140" w:type="dxa"/>
+            </w:tcMar>
+          </w:tcPr>
+          <w:p>
+            <w:r>
+              <w:rPr>
+                <w:rFonts w:ascii="Calibri" w:hAnsi="Calibri"/>
+                <w:b/>
+                <w:color w:val="0F172A"/>
+                <w:sz w:val="18"/>
+              </w:rPr>
+              <w:t>Feature Completion Matrix</w:t>
+            </w:r>
+          </w:p>
+        </w:tc>
+        <w:tc>
+          <w:tcPr>
+            <w:tcW w:type="dxa" w:w="6480"/>
+            <w:shd w:fill="F8FAFC"/>
+            <w:tcMar>
+              <w:top w:w="90" w:type="dxa"/>
+              <w:bottom w:w="90" w:type="dxa"/>
+              <w:left w:w="140" w:type="dxa"/>
+              <w:right w:w="140" w:type="dxa"/>
+            </w:tcMar>
+          </w:tcPr>
+          <w:p>
+            <w:r>
+              <w:rPr>
+                <w:rFonts w:ascii="Calibri" w:hAnsi="Calibri"/>
+                <w:color w:val="334155"/>
+                <w:sz w:val="18"/>
+              </w:rPr>
+              <w:t>Documented in README.md and docs/IMPLEMENTATION_STATUS.md (All 12 phases verified)</w:t>
+            </w:r>
+          </w:p>
+        </w:tc>
+      </w:tr>
+      <w:tr>
+        <w:tc>
+          <w:tcPr>
+            <w:tcW w:type="dxa" w:w="3312"/>
+            <w:shd w:fill="FFFFFF"/>
+            <w:tcMar>
+              <w:top w:w="90" w:type="dxa"/>
+              <w:bottom w:w="90" w:type="dxa"/>
+              <w:left w:w="140" w:type="dxa"/>
+              <w:right w:w="140" w:type="dxa"/>
+            </w:tcMar>
+          </w:tcPr>
+          <w:p>
+            <w:r>
+              <w:rPr>
+                <w:rFonts w:ascii="Calibri" w:hAnsi="Calibri"/>
+                <w:b/>
+                <w:color w:val="0F172A"/>
+                <w:sz w:val="18"/>
+              </w:rPr>
+              <w:t>Agentic AI Tooling</w:t>
+            </w:r>
+          </w:p>
+        </w:tc>
+        <w:tc>
+          <w:tcPr>
+            <w:tcW w:type="dxa" w:w="6480"/>
+            <w:shd w:fill="FFFFFF"/>
+            <w:tcMar>
+              <w:top w:w="90" w:type="dxa"/>
+              <w:bottom w:w="90" w:type="dxa"/>
+              <w:left w:w="140" w:type="dxa"/>
+              <w:right w:w="140" w:type="dxa"/>
+            </w:tcMar>
+          </w:tcPr>
+          <w:p>
+            <w:r>
+              <w:rPr>
+                <w:rFonts w:ascii="Calibri" w:hAnsi="Calibri"/>
+                <w:color w:val="334155"/>
+                <w:sz w:val="18"/>
+              </w:rPr>
+              <w:t>Documented in README.md &amp; docs/AGENTIC_WORKFLOW.md (Subagents, Skills, Hooks, MCP tooling)</w:t>
+            </w:r>
+          </w:p>
+        </w:tc>
+      </w:tr>
+      <w:tr>
+        <w:tc>
+          <w:tcPr>
+            <w:tcW w:type="dxa" w:w="3312"/>
+            <w:shd w:fill="F8FAFC"/>
+            <w:tcMar>
+              <w:top w:w="90" w:type="dxa"/>
+              <w:bottom w:w="90" w:type="dxa"/>
+              <w:left w:w="140" w:type="dxa"/>
+              <w:right w:w="140" w:type="dxa"/>
+            </w:tcMar>
+          </w:tcPr>
+          <w:p>
+            <w:r>
+              <w:rPr>
+                <w:rFonts w:ascii="Calibri" w:hAnsi="Calibri"/>
+                <w:b/>
+                <w:color w:val="0F172A"/>
+                <w:sz w:val="18"/>
+              </w:rPr>
+              <w:t>Screen Recording (2–5 min)</w:t>
+            </w:r>
+          </w:p>
+        </w:tc>
+        <w:tc>
+          <w:tcPr>
+            <w:tcW w:type="dxa" w:w="6480"/>
+            <w:shd w:fill="F8FAFC"/>
+            <w:tcMar>
+              <w:top w:w="90" w:type="dxa"/>
+              <w:bottom w:w="90" w:type="dxa"/>
+              <w:left w:w="140" w:type="dxa"/>
+              <w:right w:w="140" w:type="dxa"/>
+            </w:tcMar>
+          </w:tcPr>
+          <w:p>
+            <w:r>
+              <w:rPr>
+                <w:rFonts w:ascii="Calibri" w:hAnsi="Calibri"/>
+                <w:color w:val="334155"/>
+                <w:sz w:val="18"/>
+              </w:rPr>
+              <w:t>docs/Testimonials Project-Short.webm (Duration: 5 min 03 sec, short app walkthrough)</w:t>
+            </w:r>
+          </w:p>
+        </w:tc>
+      </w:tr>
+      <w:tr>
+        <w:tc>
+          <w:tcPr>
+            <w:tcW w:type="dxa" w:w="3312"/>
+            <w:shd w:fill="FFFFFF"/>
+            <w:tcMar>
+              <w:top w:w="90" w:type="dxa"/>
+              <w:bottom w:w="90" w:type="dxa"/>
+              <w:left w:w="140" w:type="dxa"/>
+              <w:right w:w="140" w:type="dxa"/>
+            </w:tcMar>
+          </w:tcPr>
+          <w:p>
+            <w:r>
+              <w:rPr>
+                <w:rFonts w:ascii="Calibri" w:hAnsi="Calibri"/>
+                <w:b/>
+                <w:color w:val="0F172A"/>
+                <w:sz w:val="18"/>
+              </w:rPr>
+              <w:t>Full Video Walkthrough</w:t>
+            </w:r>
+          </w:p>
+        </w:tc>
+        <w:tc>
+          <w:tcPr>
+            <w:tcW w:type="dxa" w:w="6480"/>
+            <w:shd w:fill="FFFFFF"/>
+            <w:tcMar>
+              <w:top w:w="90" w:type="dxa"/>
+              <w:bottom w:w="90" w:type="dxa"/>
+              <w:left w:w="140" w:type="dxa"/>
+              <w:right w:w="140" w:type="dxa"/>
+            </w:tcMar>
+          </w:tcPr>
+          <w:p>
+            <w:r>
+              <w:rPr>
+                <w:rFonts w:ascii="Calibri" w:hAnsi="Calibri"/>
+                <w:color w:val="334155"/>
+                <w:sz w:val="18"/>
+              </w:rPr>
+              <w:t>docs/Testimonials Project.mp4 (Duration: 15 min 03 sec, comprehensive feature demo)</w:t>
+            </w:r>
+          </w:p>
+        </w:tc>
+      </w:tr>
+      <w:tr>
+        <w:tc>
+          <w:tcPr>
+            <w:tcW w:type="dxa" w:w="3312"/>
+            <w:shd w:fill="F8FAFC"/>
+            <w:tcMar>
+              <w:top w:w="90" w:type="dxa"/>
+              <w:bottom w:w="90" w:type="dxa"/>
+              <w:left w:w="140" w:type="dxa"/>
+              <w:right w:w="140" w:type="dxa"/>
+            </w:tcMar>
+          </w:tcPr>
+          <w:p>
+            <w:r>
+              <w:rPr>
+                <w:rFonts w:ascii="Calibri" w:hAnsi="Calibri"/>
+                <w:b/>
+                <w:color w:val="0F172A"/>
+                <w:sz w:val="18"/>
+              </w:rPr>
+              <w:t>Project Reflection</w:t>
+            </w:r>
+          </w:p>
+        </w:tc>
+        <w:tc>
+          <w:tcPr>
+            <w:tcW w:type="dxa" w:w="6480"/>
+            <w:shd w:fill="F8FAFC"/>
+            <w:tcMar>
+              <w:top w:w="90" w:type="dxa"/>
+              <w:bottom w:w="90" w:type="dxa"/>
+              <w:left w:w="140" w:type="dxa"/>
+              <w:right w:w="140" w:type="dxa"/>
+            </w:tcMar>
+          </w:tcPr>
+          <w:p>
+            <w:r>
+              <w:rPr>
+                <w:rFonts w:ascii="Calibri" w:hAnsi="Calibri"/>
+                <w:color w:val="334155"/>
+                <w:sz w:val="18"/>
+              </w:rPr>
+              <w:t>Included in reflection.docx, reflection.pdf, and README.md (Word Count: 210 words)</w:t>
+            </w:r>
+          </w:p>
+        </w:tc>
+      </w:tr>
+    </w:tbl>
     <w:sectPr>
       <w:pgSz w:w="12240" w:h="15840"/>
-      <w:pgMar w:top="1440" w:right="1440" w:bottom="1440" w:left="1440" w:header="720" w:footer="720" w:gutter="0"/>
+      <w:pgMar w:top="1152" w:right="1152" w:bottom="1152" w:left="1152" w:header="720" w:footer="720" w:gutter="0"/>
       <w:cols w:space="720"/>
       <w:docGrid w:linePitch="360"/>
     </w:sectPr>

</xml_diff>

<commit_message>
fix(docs): eliminate text justification stretching and update reflection content in docx and pdf
</commit_message>
<xml_diff>
--- a/docs/reflection.docx
+++ b/docs/reflection.docx
@@ -17,6 +17,9 @@
       </w:r>
     </w:p>
     <w:p>
+      <w:pPr>
+        <w:jc w:val="left"/>
+      </w:pPr>
       <w:r>
         <w:rPr>
           <w:rFonts w:ascii="Calibri" w:hAnsi="Calibri"/>
@@ -31,6 +34,9 @@
     </w:p>
     <w:p/>
     <w:p>
+      <w:pPr>
+        <w:jc w:val="left"/>
+      </w:pPr>
       <w:r>
         <w:rPr>
           <w:rFonts w:ascii="Calibri" w:hAnsi="Calibri"/>
@@ -42,15 +48,21 @@
       </w:r>
     </w:p>
     <w:p>
+      <w:pPr>
+        <w:jc w:val="left"/>
+      </w:pPr>
       <w:r>
         <w:rPr>
           <w:rFonts w:ascii="Calibri" w:hAnsi="Calibri"/>
           <w:sz w:val="21"/>
         </w:rPr>
-        <w:t>Applying the agentic pair-programming workflow with structured context files (CLAUDE.md, CONTEXT.md) provided exceptional development velocity and architectural consistency. Explicit boundaries prevented scope creep and kept business logic strictly on the server. The plan → implement → verify rhythm worked seamlessly: the agent generated database migrations, Cashier Stripe billing, and Inertia React 19 interfaces while adhering strictly to tenant isolation policies. Integrating Model Context Protocol (MCP) tooling—specifically Chrome DevTools MCP for live DOM and viewport screenshot audits—proved game-changing for validating responsive layouts and celebratory micro-interactions without guesswork.</w:t>
+        <w:t>Applying the agentic pair-programming workflow with structured specification files (CLAUDE.md, CONTEXT.md) provided exceptional development velocity and architectural consistency. Explicit boundaries prevented scope creep while keeping business logic and tenant authorization strictly on the server. The plan → implement → verify rhythm worked seamlessly: the agent generated database migrations, Cashier Stripe subscriptions, short branded slugs (/s/{slug}), and Inertia React 19 interfaces. Integrating Model Context Protocol (MCP) tooling—notably Chrome DevTools MCP for real-time viewport screenshot audits and DOM inspection—proved invaluable for validating responsive layouts, dark/light theme switching, and celebratory micro-interactions without visual guesswork.</w:t>
       </w:r>
     </w:p>
     <w:p>
+      <w:pPr>
+        <w:jc w:val="left"/>
+      </w:pPr>
       <w:r>
         <w:rPr>
           <w:rFonts w:ascii="Calibri" w:hAnsi="Calibri"/>
@@ -62,15 +74,21 @@
       </w:r>
     </w:p>
     <w:p>
+      <w:pPr>
+        <w:jc w:val="left"/>
+      </w:pPr>
       <w:r>
         <w:rPr>
           <w:rFonts w:ascii="Calibri" w:hAnsi="Calibri"/>
           <w:sz w:val="21"/>
         </w:rPr>
-        <w:t>The primary challenge arose during profile photo uploads and settings view refinement. Initially, settings pages suffered from cavernous empty space on wide viewports, and standard PATCH HTTP requests struggled with PHP multipart form parsing boundaries. We diagnosed and resolved this by restructuring the settings layout into a balanced max-w-5xl container using modular card components, configuring dual HTTP method routing (Route::match(['patch', 'post'])), and implementing automated Pest feature tests to guarantee atomic disk storage cleanup whenever avatars were replaced or deleted.</w:t>
+        <w:t>Two primary challenges arose during development: avatar file uploads and iframe embed theme clashes. Early settings pages suffered from wide-viewport whitespace, and standard PATCH HTTP requests conflicted with PHP multipart form boundaries; we resolved this with modular card layouts, dual-method routing (Route::match(['patch', 'post'])), and atomic disk cleanup tests. Later, the standalone embed widget encountered a dark-mode canvas clash where Chromium rendered transparent iframes as opaque black over host sites; we fixed this by strictly isolating color-scheme properties and removing layout-level theme overrides inside embed routes.</w:t>
       </w:r>
     </w:p>
     <w:p>
+      <w:pPr>
+        <w:jc w:val="left"/>
+      </w:pPr>
       <w:r>
         <w:rPr>
           <w:rFonts w:ascii="Calibri" w:hAnsi="Calibri"/>
@@ -82,16 +100,22 @@
       </w:r>
     </w:p>
     <w:p>
+      <w:pPr>
+        <w:jc w:val="left"/>
+      </w:pPr>
       <w:r>
         <w:rPr>
           <w:rFonts w:ascii="Calibri" w:hAnsi="Calibri"/>
           <w:sz w:val="21"/>
         </w:rPr>
-        <w:t>In future agentic projects, I would establish design layout tokens and reusable UI card primitives during initial setup rather than refining them after backend feature implementation. Furthermore, I would embed automated headless browser visual regression checks directly into subagent milestone gates from day one, catching UX and spacing gaps before proceeding to release verification.</w:t>
+        <w:t>In future agentic projects, I would establish design tokens and reusable UI card primitives during initial project bootstrapping rather than refining them post-implementation. Furthermore, I would integrate automated headless visual regression checks directly into subagent milestone gates from day one, catching UX and spacing gaps before proceeding to final verification.</w:t>
       </w:r>
     </w:p>
     <w:p/>
     <w:p>
+      <w:pPr>
+        <w:jc w:val="left"/>
+      </w:pPr>
       <w:r>
         <w:rPr>
           <w:rFonts w:ascii="Calibri" w:hAnsi="Calibri"/>
@@ -126,6 +150,9 @@
             </w:tcMar>
           </w:tcPr>
           <w:p>
+            <w:pPr>
+              <w:jc w:val="left"/>
+            </w:pPr>
             <w:r>
               <w:rPr>
                 <w:rFonts w:ascii="Calibri" w:hAnsi="Calibri"/>
@@ -149,6 +176,9 @@
             </w:tcMar>
           </w:tcPr>
           <w:p>
+            <w:pPr>
+              <w:jc w:val="left"/>
+            </w:pPr>
             <w:r>
               <w:rPr>
                 <w:rFonts w:ascii="Calibri" w:hAnsi="Calibri"/>
@@ -174,6 +204,9 @@
             </w:tcMar>
           </w:tcPr>
           <w:p>
+            <w:pPr>
+              <w:jc w:val="left"/>
+            </w:pPr>
             <w:r>
               <w:rPr>
                 <w:rFonts w:ascii="Calibri" w:hAnsi="Calibri"/>
@@ -197,6 +230,9 @@
             </w:tcMar>
           </w:tcPr>
           <w:p>
+            <w:pPr>
+              <w:jc w:val="left"/>
+            </w:pPr>
             <w:r>
               <w:rPr>
                 <w:rFonts w:ascii="Calibri" w:hAnsi="Calibri"/>
@@ -221,6 +257,9 @@
             </w:tcMar>
           </w:tcPr>
           <w:p>
+            <w:pPr>
+              <w:jc w:val="left"/>
+            </w:pPr>
             <w:r>
               <w:rPr>
                 <w:rFonts w:ascii="Calibri" w:hAnsi="Calibri"/>
@@ -244,6 +283,9 @@
             </w:tcMar>
           </w:tcPr>
           <w:p>
+            <w:pPr>
+              <w:jc w:val="left"/>
+            </w:pPr>
             <w:r>
               <w:rPr>
                 <w:rFonts w:ascii="Calibri" w:hAnsi="Calibri"/>
@@ -268,6 +310,9 @@
             </w:tcMar>
           </w:tcPr>
           <w:p>
+            <w:pPr>
+              <w:jc w:val="left"/>
+            </w:pPr>
             <w:r>
               <w:rPr>
                 <w:rFonts w:ascii="Calibri" w:hAnsi="Calibri"/>
@@ -291,6 +336,9 @@
             </w:tcMar>
           </w:tcPr>
           <w:p>
+            <w:pPr>
+              <w:jc w:val="left"/>
+            </w:pPr>
             <w:r>
               <w:rPr>
                 <w:rFonts w:ascii="Calibri" w:hAnsi="Calibri"/>
@@ -315,6 +363,9 @@
             </w:tcMar>
           </w:tcPr>
           <w:p>
+            <w:pPr>
+              <w:jc w:val="left"/>
+            </w:pPr>
             <w:r>
               <w:rPr>
                 <w:rFonts w:ascii="Calibri" w:hAnsi="Calibri"/>
@@ -338,6 +389,9 @@
             </w:tcMar>
           </w:tcPr>
           <w:p>
+            <w:pPr>
+              <w:jc w:val="left"/>
+            </w:pPr>
             <w:r>
               <w:rPr>
                 <w:rFonts w:ascii="Calibri" w:hAnsi="Calibri"/>
@@ -362,6 +416,9 @@
             </w:tcMar>
           </w:tcPr>
           <w:p>
+            <w:pPr>
+              <w:jc w:val="left"/>
+            </w:pPr>
             <w:r>
               <w:rPr>
                 <w:rFonts w:ascii="Calibri" w:hAnsi="Calibri"/>
@@ -385,6 +442,9 @@
             </w:tcMar>
           </w:tcPr>
           <w:p>
+            <w:pPr>
+              <w:jc w:val="left"/>
+            </w:pPr>
             <w:r>
               <w:rPr>
                 <w:rFonts w:ascii="Calibri" w:hAnsi="Calibri"/>
@@ -409,6 +469,9 @@
             </w:tcMar>
           </w:tcPr>
           <w:p>
+            <w:pPr>
+              <w:jc w:val="left"/>
+            </w:pPr>
             <w:r>
               <w:rPr>
                 <w:rFonts w:ascii="Calibri" w:hAnsi="Calibri"/>
@@ -432,6 +495,9 @@
             </w:tcMar>
           </w:tcPr>
           <w:p>
+            <w:pPr>
+              <w:jc w:val="left"/>
+            </w:pPr>
             <w:r>
               <w:rPr>
                 <w:rFonts w:ascii="Calibri" w:hAnsi="Calibri"/>
@@ -456,6 +522,9 @@
             </w:tcMar>
           </w:tcPr>
           <w:p>
+            <w:pPr>
+              <w:jc w:val="left"/>
+            </w:pPr>
             <w:r>
               <w:rPr>
                 <w:rFonts w:ascii="Calibri" w:hAnsi="Calibri"/>
@@ -479,13 +548,16 @@
             </w:tcMar>
           </w:tcPr>
           <w:p>
+            <w:pPr>
+              <w:jc w:val="left"/>
+            </w:pPr>
             <w:r>
               <w:rPr>
                 <w:rFonts w:ascii="Calibri" w:hAnsi="Calibri"/>
                 <w:color w:val="334155"/>
                 <w:sz w:val="18"/>
               </w:rPr>
-              <w:t>Included in reflection.docx, reflection.pdf, and README.md (Word Count: 210 words)</w:t>
+              <w:t>Included in reflection.docx and reflection.pdf (Word Count: 242 words)</w:t>
             </w:r>
           </w:p>
         </w:tc>

</xml_diff>